<commit_message>
Add 4부 1–16화 Milano scripts (complete part 4, 100 turns each, pre-20th-century quotations)
Co-Authored-By: Claude Sonnet 5.5 <noreply@anthropic.com>
Claude-Session: https://claude.ai/code/session_01WyxyqRkqEq9dNr3RKGdFPu
</commit_message>
<xml_diff>
--- a/milano/4부11화_Il_contratto.docx
+++ b/milano/4부11화_Il_contratto.docx
@@ -2906,7 +2906,7 @@
           <w:b w:val="0"/>
           <w:sz w:val="21"/>
         </w:rPr>
-        <w:t>L'inaugurazione la facciamo di giovedì. Il terzo giovedì di ottobre, se riusciamo.</w:t>
+        <w:t>L'inaugurazione la facciamo di giovedì. Il secondo giovedì di ottobre, se riusciamo.</w:t>
       </w:r>
     </w:p>
     <w:p>
@@ -2935,7 +2935,7 @@
           <w:b w:val="0"/>
           <w:sz w:val="21"/>
         </w:rPr>
-        <w:t>Perfetto. È il giorno in cui il circolo si riunisce da sempre, e l'apertura nuova sarà proprio il «terzo giovedì».</w:t>
+        <w:t>Perfetto. Il giovedì è il giorno del circolo. E la settimana dopo, nel terzo giovedì, festeggeremo l'anniversario.</w:t>
       </w:r>
     </w:p>
     <w:p>
@@ -2964,7 +2964,7 @@
           <w:b w:val="0"/>
           <w:sz w:val="21"/>
         </w:rPr>
-        <w:t>Il terzo giovedì di ottobre. Un anno dalla prima volta che sono entrata, in ritardo, con l'ombrello rotto.</w:t>
+        <w:t>L'anniversario! Un anno dalla prima volta che sono entrata, in ritardo, con l'ombrello rotto.</w:t>
       </w:r>
     </w:p>
     <w:p>
@@ -3022,7 +3022,7 @@
           <w:b w:val="0"/>
           <w:sz w:val="21"/>
         </w:rPr>
-        <w:t>Allora è deciso. Fra tre settimane. E Davide, tu fai da cerimoniere, finché non parti per Bologna.</w:t>
+        <w:t>Allora è deciso. Fra due settimane. E Davide, tu fai da cerimoniere, finché non parti per Bologna.</w:t>
       </w:r>
     </w:p>
     <w:p>
@@ -3265,7 +3265,7 @@
           <w:b w:val="0"/>
           <w:sz w:val="21"/>
         </w:rPr>
-        <w:t>은행에서 마테오와 안나는 대출을 신청하지만 담보가 부족하다는 지적을 받습니다. 그때 발레리아가 나타나 자신의 집을 보증으로 내놓으며(지점장은 그녀의 옛 제자) 대출이 승인됩니다. 이어 공증인 사무실에서 서점 양도 계약이 체결되고, 재고 목록에는 '개 한 마리(사용 대여)'와 '스툴(역사적 가치 산정 불가)'이 올라 있습니다. 발레리아는 서명 뒤 만초니 결말부를 낭독하며 "신중함만으로도, 맹목적 믿음만으로도 충분하지 않다"는 균형을 일러 줍니다. 개점일은 10월 셋째 목요일, 곧 두 사람이 처음 서점에 들어선 지 1년이 되는 날로 정해집니다.</w:t>
+        <w:t>은행에서 마테오와 안나는 대출을 신청하지만 담보가 부족하다는 지적을 받습니다. 그때 발레리아가 나타나 자신의 집을 보증으로 내놓으며(지점장은 그녀의 옛 제자) 대출이 승인됩니다. 이어 공증인 사무실에서 서점 양도 계약이 체결되고, 재고 목록에는 '개 한 마리(사용 대여)'와 '스툴(역사적 가치 산정 불가)'이 올라 있습니다. 발레리아는 서명 뒤 만초니 결말부를 낭독하며 "신중함만으로도, 맹목적 믿음만으로도 충분하지 않다"는 균형을 일러 줍니다. 개점일은 10월 둘째 목요일로, 그다음 주 셋째 목요일에는 두 사람이 처음 서점에 들어선 지 1년이 되는 기념일이 이어집니다.</w:t>
       </w:r>
     </w:p>
     <w:p>

</xml_diff>